<commit_message>
Cập nhật file README
</commit_message>
<xml_diff>
--- a/Tên ứng dụng_ AppThiThuATLD.docx
+++ b/Tên ứng dụng_ AppThiThuATLD.docx
@@ -3639,6 +3639,7 @@
       <w:r>
         <w:rPr>
           <w:rFonts w:ascii="Times New Roman" w:eastAsia="Times New Roman" w:hAnsi="Times New Roman" w:cs="Times New Roman"/>
+          <w:noProof/>
           <w:sz w:val="28"/>
           <w:szCs w:val="28"/>
         </w:rPr>
@@ -3714,6 +3715,7 @@
       <w:r>
         <w:rPr>
           <w:rFonts w:ascii="Times New Roman" w:eastAsia="Times New Roman" w:hAnsi="Times New Roman" w:cs="Times New Roman"/>
+          <w:noProof/>
           <w:sz w:val="28"/>
           <w:szCs w:val="28"/>
           <w:lang w:val="en-US"/>
@@ -3790,6 +3792,7 @@
       <w:r>
         <w:rPr>
           <w:rFonts w:ascii="Times New Roman" w:eastAsia="Times New Roman" w:hAnsi="Times New Roman" w:cs="Times New Roman"/>
+          <w:noProof/>
           <w:sz w:val="28"/>
           <w:szCs w:val="28"/>
           <w:lang w:val="en-US"/>
@@ -3868,6 +3871,7 @@
       <w:r>
         <w:rPr>
           <w:rFonts w:ascii="Times New Roman" w:eastAsia="Times New Roman" w:hAnsi="Times New Roman" w:cs="Times New Roman"/>
+          <w:noProof/>
           <w:sz w:val="28"/>
           <w:szCs w:val="28"/>
           <w:lang w:val="en-US"/>
@@ -8166,6 +8170,7 @@
       <w:r>
         <w:rPr>
           <w:rFonts w:ascii="Times New Roman" w:eastAsia="Times New Roman" w:hAnsi="Times New Roman" w:cs="Times New Roman"/>
+          <w:noProof/>
           <w:sz w:val="28"/>
           <w:szCs w:val="28"/>
           <w:lang w:val="en-US"/>
@@ -8243,6 +8248,7 @@
       <w:r>
         <w:rPr>
           <w:rFonts w:ascii="Times New Roman" w:eastAsia="Times New Roman" w:hAnsi="Times New Roman" w:cs="Times New Roman"/>
+          <w:noProof/>
           <w:sz w:val="28"/>
           <w:szCs w:val="28"/>
           <w:lang w:val="en-US"/>
@@ -8320,6 +8326,7 @@
       <w:r>
         <w:rPr>
           <w:rFonts w:ascii="Times New Roman" w:eastAsia="Times New Roman" w:hAnsi="Times New Roman" w:cs="Times New Roman"/>
+          <w:noProof/>
           <w:sz w:val="28"/>
           <w:szCs w:val="28"/>
           <w:lang w:val="en-US"/>
@@ -8400,6 +8407,7 @@
       <w:r>
         <w:rPr>
           <w:rFonts w:ascii="Times New Roman" w:eastAsia="Times New Roman" w:hAnsi="Times New Roman" w:cs="Times New Roman"/>
+          <w:noProof/>
           <w:sz w:val="28"/>
           <w:szCs w:val="28"/>
         </w:rPr>
@@ -9237,6 +9245,7 @@
       <w:r>
         <w:rPr>
           <w:rFonts w:ascii="Times New Roman" w:eastAsia="Times New Roman" w:hAnsi="Times New Roman" w:cs="Times New Roman"/>
+          <w:noProof/>
           <w:sz w:val="28"/>
           <w:szCs w:val="28"/>
           <w:lang w:val="en-US"/>
@@ -9313,6 +9322,7 @@
       <w:r>
         <w:rPr>
           <w:rFonts w:ascii="Times New Roman" w:eastAsia="Times New Roman" w:hAnsi="Times New Roman" w:cs="Times New Roman"/>
+          <w:noProof/>
           <w:sz w:val="28"/>
           <w:szCs w:val="28"/>
           <w:lang w:val="en-US"/>
@@ -9432,6 +9442,7 @@
       <w:r>
         <w:rPr>
           <w:rFonts w:ascii="Times New Roman" w:eastAsia="Times New Roman" w:hAnsi="Times New Roman" w:cs="Times New Roman"/>
+          <w:noProof/>
           <w:sz w:val="28"/>
           <w:szCs w:val="28"/>
           <w:lang w:val="en-US"/>
@@ -9508,6 +9519,7 @@
       <w:r>
         <w:rPr>
           <w:rFonts w:ascii="Times New Roman" w:eastAsia="Times New Roman" w:hAnsi="Times New Roman" w:cs="Times New Roman"/>
+          <w:noProof/>
           <w:sz w:val="28"/>
           <w:szCs w:val="28"/>
           <w:lang w:val="en-US"/>
@@ -9633,9 +9645,9 @@
       </w:tblPr>
       <w:tblGrid>
         <w:gridCol w:w="2588"/>
-        <w:gridCol w:w="2690"/>
+        <w:gridCol w:w="2646"/>
         <w:gridCol w:w="2586"/>
-        <w:gridCol w:w="2466"/>
+        <w:gridCol w:w="2656"/>
       </w:tblGrid>
       <w:tr>
         <w:tc>
@@ -9759,7 +9771,6 @@
                 <w:bCs/>
                 <w:sz w:val="28"/>
                 <w:szCs w:val="28"/>
-                <w:lang w:val="en-US"/>
               </w:rPr>
             </w:pPr>
             <w:r>
@@ -9817,6 +9828,7 @@
                 <w:rFonts w:ascii="Times New Roman" w:eastAsia="Times New Roman" w:hAnsi="Times New Roman" w:cs="Times New Roman"/>
                 <w:b/>
                 <w:bCs/>
+                <w:noProof/>
                 <w:sz w:val="28"/>
                 <w:szCs w:val="28"/>
               </w:rPr>
@@ -9874,40 +9886,50 @@
             </w:pPr>
             <w:r>
               <w:rPr>
-                <w:rFonts w:ascii="Times New Roman" w:eastAsia="Times New Roman" w:hAnsi="Times New Roman" w:cs="Times New Roman"/>
                 <w:noProof/>
-                <w:sz w:val="28"/>
-                <w:szCs w:val="28"/>
               </w:rPr>
               <w:drawing>
-                <wp:inline distT="114300" distB="114300" distL="114300" distR="114300" wp14:anchorId="7F809EA7" wp14:editId="52CEF4BA">
-                  <wp:extent cx="1570990" cy="3105150"/>
-                  <wp:effectExtent l="0" t="0" r="0" b="0"/>
-                  <wp:docPr id="7" name="image13.png"/>
-                  <wp:cNvGraphicFramePr/>
+                <wp:inline distT="0" distB="0" distL="0" distR="0" wp14:anchorId="3239181F" wp14:editId="088CD99A">
+                  <wp:extent cx="1535262" cy="3194050"/>
+                  <wp:effectExtent l="0" t="0" r="8255" b="6350"/>
+                  <wp:docPr id="1490182511" name="Picture 54"/>
+                  <wp:cNvGraphicFramePr>
+                    <a:graphicFrameLocks xmlns:a="http://schemas.openxmlformats.org/drawingml/2006/main" noChangeAspect="1"/>
+                  </wp:cNvGraphicFramePr>
                   <a:graphic xmlns:a="http://schemas.openxmlformats.org/drawingml/2006/main">
                     <a:graphicData uri="http://schemas.openxmlformats.org/drawingml/2006/picture">
                       <pic:pic xmlns:pic="http://schemas.openxmlformats.org/drawingml/2006/picture">
                         <pic:nvPicPr>
-                          <pic:cNvPr id="0" name="image13.png"/>
-                          <pic:cNvPicPr preferRelativeResize="0"/>
+                          <pic:cNvPr id="0" name="Picture 1"/>
+                          <pic:cNvPicPr>
+                            <a:picLocks noChangeAspect="1" noChangeArrowheads="1"/>
+                          </pic:cNvPicPr>
                         </pic:nvPicPr>
                         <pic:blipFill>
-                          <a:blip r:embed="rId21"/>
+                          <a:blip r:embed="rId21">
+                            <a:extLst>
+                              <a:ext uri="{28A0092B-C50C-407E-A947-70E740481C1C}">
+                                <a14:useLocalDpi xmlns:a14="http://schemas.microsoft.com/office/drawing/2010/main" val="0"/>
+                              </a:ext>
+                            </a:extLst>
+                          </a:blip>
                           <a:srcRect/>
                           <a:stretch>
                             <a:fillRect/>
                           </a:stretch>
                         </pic:blipFill>
-                        <pic:spPr>
+                        <pic:spPr bwMode="auto">
                           <a:xfrm>
                             <a:off x="0" y="0"/>
-                            <a:ext cx="1571571" cy="3106298"/>
+                            <a:ext cx="1546051" cy="3216497"/>
                           </a:xfrm>
                           <a:prstGeom prst="rect">
                             <a:avLst/>
                           </a:prstGeom>
-                          <a:ln/>
+                          <a:noFill/>
+                          <a:ln>
+                            <a:noFill/>
+                          </a:ln>
                         </pic:spPr>
                       </pic:pic>
                     </a:graphicData>
@@ -9936,6 +9958,7 @@
                 <w:rFonts w:ascii="Times New Roman" w:eastAsia="Times New Roman" w:hAnsi="Times New Roman" w:cs="Times New Roman"/>
                 <w:b/>
                 <w:bCs/>
+                <w:noProof/>
                 <w:sz w:val="28"/>
                 <w:szCs w:val="28"/>
               </w:rPr>
@@ -9993,40 +10016,50 @@
             </w:pPr>
             <w:r>
               <w:rPr>
-                <w:rFonts w:ascii="Times New Roman" w:eastAsia="Times New Roman" w:hAnsi="Times New Roman" w:cs="Times New Roman"/>
                 <w:noProof/>
-                <w:sz w:val="28"/>
-                <w:szCs w:val="28"/>
               </w:rPr>
               <w:drawing>
-                <wp:inline distT="114300" distB="114300" distL="114300" distR="114300" wp14:anchorId="6D7FF1FE" wp14:editId="719E3583">
-                  <wp:extent cx="1428750" cy="3126105"/>
-                  <wp:effectExtent l="0" t="0" r="0" b="0"/>
-                  <wp:docPr id="11" name="image12.png"/>
-                  <wp:cNvGraphicFramePr/>
+                <wp:inline distT="0" distB="0" distL="0" distR="0" wp14:anchorId="109E55BA" wp14:editId="5040E4BF">
+                  <wp:extent cx="1549758" cy="3155950"/>
+                  <wp:effectExtent l="0" t="0" r="0" b="6350"/>
+                  <wp:docPr id="924852133" name="Picture 55"/>
+                  <wp:cNvGraphicFramePr>
+                    <a:graphicFrameLocks xmlns:a="http://schemas.openxmlformats.org/drawingml/2006/main" noChangeAspect="1"/>
+                  </wp:cNvGraphicFramePr>
                   <a:graphic xmlns:a="http://schemas.openxmlformats.org/drawingml/2006/main">
                     <a:graphicData uri="http://schemas.openxmlformats.org/drawingml/2006/picture">
                       <pic:pic xmlns:pic="http://schemas.openxmlformats.org/drawingml/2006/picture">
                         <pic:nvPicPr>
-                          <pic:cNvPr id="0" name="image12.png"/>
-                          <pic:cNvPicPr preferRelativeResize="0"/>
+                          <pic:cNvPr id="0" name="Picture 3"/>
+                          <pic:cNvPicPr>
+                            <a:picLocks noChangeAspect="1" noChangeArrowheads="1"/>
+                          </pic:cNvPicPr>
                         </pic:nvPicPr>
                         <pic:blipFill>
-                          <a:blip r:embed="rId23"/>
+                          <a:blip r:embed="rId23">
+                            <a:extLst>
+                              <a:ext uri="{28A0092B-C50C-407E-A947-70E740481C1C}">
+                                <a14:useLocalDpi xmlns:a14="http://schemas.microsoft.com/office/drawing/2010/main" val="0"/>
+                              </a:ext>
+                            </a:extLst>
+                          </a:blip>
                           <a:srcRect/>
                           <a:stretch>
                             <a:fillRect/>
                           </a:stretch>
                         </pic:blipFill>
-                        <pic:spPr>
+                        <pic:spPr bwMode="auto">
                           <a:xfrm>
                             <a:off x="0" y="0"/>
-                            <a:ext cx="1442991" cy="3157265"/>
+                            <a:ext cx="1562262" cy="3181413"/>
                           </a:xfrm>
                           <a:prstGeom prst="rect">
                             <a:avLst/>
                           </a:prstGeom>
-                          <a:ln/>
+                          <a:noFill/>
+                          <a:ln>
+                            <a:noFill/>
+                          </a:ln>
                         </pic:spPr>
                       </pic:pic>
                     </a:graphicData>
@@ -15945,6 +15978,7 @@
   <w:style w:type="character" w:default="1" w:styleId="DefaultParagraphFont">
     <w:name w:val="Default Paragraph Font"/>
     <w:uiPriority w:val="1"/>
+    <w:semiHidden/>
     <w:unhideWhenUsed/>
   </w:style>
   <w:style w:type="table" w:default="1" w:styleId="TableNormal">

</xml_diff>